<commit_message>
rest of comments for mainboard
</commit_message>
<xml_diff>
--- a/DW Comment_ Primary Sensor Page.docx
+++ b/DW Comment_ Primary Sensor Page.docx
@@ -18,12 +18,12 @@
           <wp:inline distB="0" distT="0" distL="0" distR="0">
             <wp:extent cx="4870426" cy="3988962"/>
             <wp:effectExtent b="0" l="0" r="0" t="0"/>
-            <wp:docPr id="890503192" name="image3.png"/>
+            <wp:docPr id="890503192" name="image4.png"/>
             <a:graphic>
               <a:graphicData uri="http://schemas.openxmlformats.org/drawingml/2006/picture">
                 <pic:pic>
                   <pic:nvPicPr>
-                    <pic:cNvPr id="0" name="image3.png"/>
+                    <pic:cNvPr id="0" name="image4.png"/>
                     <pic:cNvPicPr preferRelativeResize="0"/>
                   </pic:nvPicPr>
                   <pic:blipFill>
@@ -406,7 +406,7 @@
       </w:r>
       <w:sdt>
         <w:sdtPr>
-          <w:id w:val="-853014101"/>
+          <w:id w:val="-1948366813"/>
           <w:tag w:val="goog_rdk_0"/>
         </w:sdtPr>
         <w:sdtContent>
@@ -673,7 +673,7 @@
       </w:r>
       <w:sdt>
         <w:sdtPr>
-          <w:id w:val="612472439"/>
+          <w:id w:val="677882897"/>
           <w:tag w:val="goog_rdk_1"/>
         </w:sdtPr>
         <w:sdtContent>
@@ -797,12 +797,12 @@
           <wp:inline distB="0" distT="0" distL="0" distR="0">
             <wp:extent cx="5943600" cy="3337560"/>
             <wp:effectExtent b="0" l="0" r="0" t="0"/>
-            <wp:docPr id="890503193" name="image2.png"/>
+            <wp:docPr id="890503193" name="image3.png"/>
             <a:graphic>
               <a:graphicData uri="http://schemas.openxmlformats.org/drawingml/2006/picture">
                 <pic:pic>
                   <pic:nvPicPr>
-                    <pic:cNvPr id="0" name="image2.png"/>
+                    <pic:cNvPr id="0" name="image3.png"/>
                     <pic:cNvPicPr preferRelativeResize="0"/>
                   </pic:nvPicPr>
                   <pic:blipFill>
@@ -1028,7 +1028,7 @@
       </w:r>
       <w:sdt>
         <w:sdtPr>
-          <w:id w:val="-2144171009"/>
+          <w:id w:val="940626788"/>
           <w:tag w:val="goog_rdk_2"/>
         </w:sdtPr>
         <w:sdtContent>
@@ -1138,12 +1138,12 @@
           <wp:inline distB="0" distT="0" distL="0" distR="0">
             <wp:extent cx="5943600" cy="2964815"/>
             <wp:effectExtent b="0" l="0" r="0" t="0"/>
-            <wp:docPr id="890503195" name="image4.png"/>
+            <wp:docPr id="890503195" name="image2.png"/>
             <a:graphic>
               <a:graphicData uri="http://schemas.openxmlformats.org/drawingml/2006/picture">
                 <pic:pic>
                   <pic:nvPicPr>
-                    <pic:cNvPr id="0" name="image4.png"/>
+                    <pic:cNvPr id="0" name="image2.png"/>
                     <pic:cNvPicPr preferRelativeResize="0"/>
                   </pic:nvPicPr>
                   <pic:blipFill>

</xml_diff>